<commit_message>
Pexels images + catalog from listini + custom request flow + auto-deploy
- Integrated Pexels API: 36 images cached in Firestore (categorie + prodotti)
- New CatalogImage widget with attribution chip per Pexels License
- Catalog generated from Listini/catalogo.csv (6 cat, 30 prod, 129 varianti)
- sync_listini.py with UTF-8 BOM handling for Excel italiano
- New feature: Lavoro Personalizzato (richiesta preventivo end-to-end)
- New OrderStatus: quoteRequested + quoted
- Operator quote form + customer accept/decline UI
- Deploy.bat for manual deploy
- Encoding fix: dart strings escaped to \uXXXX for compiler safety
</commit_message>
<xml_diff>
--- a/docs/MANUALE_GENERALE_Silvestre.docx
+++ b/docs/MANUALE_GENERALE_Silvestre.docx
@@ -794,6 +794,576 @@
           <w:sz w:val="22"/>
         </w:rPr>
         <w:t>⚠  Senza FIREBASE l'app non funziona proprio. Senza CLOUDINARY le foto non si caricano. Sono entrambi essenziali e operativi adesso.</w:t>
+      </w:r>
+    </w:p>
+    <w:p>
+      <w:r>
+        <w:br w:type="page"/>
+      </w:r>
+    </w:p>
+    <w:p>
+      <w:pPr>
+        <w:pStyle w:val="Heading1"/>
+      </w:pPr>
+      <w:r>
+        <w:rPr>
+          <w:rFonts w:ascii="Calibri" w:hAnsi="Calibri"/>
+          <w:color w:val="F47521"/>
+        </w:rPr>
+        <w:t>2.5 La tua app è GIÀ ONLINE</w:t>
+      </w:r>
+    </w:p>
+    <w:p>
+      <w:r>
+        <w:rPr>
+          <w:rFonts w:ascii="Calibri" w:hAnsi="Calibri"/>
+          <w:b w:val="0"/>
+          <w:i w:val="0"/>
+          <w:color w:val="2B2B2B"/>
+          <w:sz w:val="22"/>
+        </w:rPr>
+        <w:t>L'app è pubblicata sul cloud di Google ed è raggiungibile da qualsiasi telefono o computer del mondo. Niente Apple/Google store ancora — solo URL web.</w:t>
+      </w:r>
+    </w:p>
+    <w:p/>
+    <w:p>
+      <w:r>
+        <w:rPr>
+          <w:rFonts w:ascii="Calibri" w:hAnsi="Calibri"/>
+          <w:b/>
+          <w:i w:val="0"/>
+          <w:color w:val="2B2B2B"/>
+          <w:sz w:val="22"/>
+        </w:rPr>
+        <w:t>URL pubblico:</w:t>
+      </w:r>
+    </w:p>
+    <w:p>
+      <w:r>
+        <w:rPr>
+          <w:rFonts w:ascii="Calibri" w:hAnsi="Calibri"/>
+          <w:b/>
+          <w:i w:val="0"/>
+          <w:color w:val="1F77B4"/>
+          <w:sz w:val="22"/>
+        </w:rPr>
+        <w:t xml:space="preserve">  https://silvestre-fotoservizi.web.app</w:t>
+      </w:r>
+    </w:p>
+    <w:p/>
+    <w:p>
+      <w:r>
+        <w:rPr>
+          <w:rFonts w:ascii="Calibri" w:hAnsi="Calibri"/>
+          <w:b/>
+          <w:i w:val="0"/>
+          <w:color w:val="2B2B2B"/>
+          <w:sz w:val="22"/>
+        </w:rPr>
+        <w:t>Come installarla "come app" su iPhone:</w:t>
+      </w:r>
+    </w:p>
+    <w:p>
+      <w:pPr>
+        <w:pStyle w:val="ListNumber"/>
+      </w:pPr>
+      <w:r>
+        <w:rPr>
+          <w:rFonts w:ascii="Calibri" w:hAnsi="Calibri"/>
+          <w:sz w:val="22"/>
+        </w:rPr>
+        <w:t>Apri Safari (NON Chrome — Apple permette "Aggiungi a Home" solo da Safari)</w:t>
+      </w:r>
+    </w:p>
+    <w:p>
+      <w:pPr>
+        <w:pStyle w:val="ListNumber"/>
+      </w:pPr>
+      <w:r>
+        <w:rPr>
+          <w:rFonts w:ascii="Calibri" w:hAnsi="Calibri"/>
+          <w:sz w:val="22"/>
+        </w:rPr>
+        <w:t>Vai a https://silvestre-fotoservizi.web.app</w:t>
+      </w:r>
+    </w:p>
+    <w:p>
+      <w:pPr>
+        <w:pStyle w:val="ListNumber"/>
+      </w:pPr>
+      <w:r>
+        <w:rPr>
+          <w:rFonts w:ascii="Calibri" w:hAnsi="Calibri"/>
+          <w:sz w:val="22"/>
+        </w:rPr>
+        <w:t>Tocca icona Condividi (quadrato con freccia su, in basso al centro)</w:t>
+      </w:r>
+    </w:p>
+    <w:p>
+      <w:pPr>
+        <w:pStyle w:val="ListNumber"/>
+      </w:pPr>
+      <w:r>
+        <w:rPr>
+          <w:rFonts w:ascii="Calibri" w:hAnsi="Calibri"/>
+          <w:sz w:val="22"/>
+        </w:rPr>
+        <w:t>Scorri menu → "Aggiungi alla schermata Home"</w:t>
+      </w:r>
+    </w:p>
+    <w:p>
+      <w:pPr>
+        <w:pStyle w:val="ListNumber"/>
+      </w:pPr>
+      <w:r>
+        <w:rPr>
+          <w:rFonts w:ascii="Calibri" w:hAnsi="Calibri"/>
+          <w:sz w:val="22"/>
+        </w:rPr>
+        <w:t>Conferma "Silvestre" → Aggiungi</w:t>
+      </w:r>
+    </w:p>
+    <w:p>
+      <w:pPr>
+        <w:pStyle w:val="ListNumber"/>
+      </w:pPr>
+      <w:r>
+        <w:rPr>
+          <w:rFonts w:ascii="Calibri" w:hAnsi="Calibri"/>
+          <w:sz w:val="22"/>
+        </w:rPr>
+        <w:t>Esci da Safari → trovi l'icona arancione sulla home del telefono</w:t>
+      </w:r>
+    </w:p>
+    <w:p>
+      <w:pPr>
+        <w:pStyle w:val="ListNumber"/>
+      </w:pPr>
+      <w:r>
+        <w:rPr>
+          <w:rFonts w:ascii="Calibri" w:hAnsi="Calibri"/>
+          <w:sz w:val="22"/>
+        </w:rPr>
+        <w:t>Tocca → si apre a tutto schermo come un'app vera</w:t>
+      </w:r>
+    </w:p>
+    <w:p>
+      <w:r>
+        <w:rPr>
+          <w:rFonts w:ascii="Calibri" w:hAnsi="Calibri"/>
+          <w:b/>
+          <w:i w:val="0"/>
+          <w:color w:val="2B2B2B"/>
+          <w:sz w:val="22"/>
+        </w:rPr>
+        <w:t>Come installarla su Android:</w:t>
+      </w:r>
+    </w:p>
+    <w:p>
+      <w:pPr>
+        <w:pStyle w:val="ListNumber"/>
+      </w:pPr>
+      <w:r>
+        <w:rPr>
+          <w:rFonts w:ascii="Calibri" w:hAnsi="Calibri"/>
+          <w:sz w:val="22"/>
+        </w:rPr>
+        <w:t>Apri Chrome → vai all'URL sopra</w:t>
+      </w:r>
+    </w:p>
+    <w:p>
+      <w:pPr>
+        <w:pStyle w:val="ListNumber"/>
+      </w:pPr>
+      <w:r>
+        <w:rPr>
+          <w:rFonts w:ascii="Calibri" w:hAnsi="Calibri"/>
+          <w:sz w:val="22"/>
+        </w:rPr>
+        <w:t>Chrome propone automaticamente "Installa Silvestre Fotoservizi" (banner in basso)</w:t>
+      </w:r>
+    </w:p>
+    <w:p>
+      <w:pPr>
+        <w:pStyle w:val="ListNumber"/>
+      </w:pPr>
+      <w:r>
+        <w:rPr>
+          <w:rFonts w:ascii="Calibri" w:hAnsi="Calibri"/>
+          <w:sz w:val="22"/>
+        </w:rPr>
+        <w:t>Tocca "Installa" → fatto. In alternativa: menù 3 puntini ⋮ → "Installa app"</w:t>
+      </w:r>
+    </w:p>
+    <w:p>
+      <w:r>
+        <w:rPr>
+          <w:rFonts w:ascii="Calibri" w:hAnsi="Calibri"/>
+          <w:b/>
+          <w:color w:val="3DA35D"/>
+          <w:sz w:val="22"/>
+        </w:rPr>
+        <w:t>💡  Per condividere l'app con clienti/amici basta inviargli il link https://silvestre-fotoservizi.web.app via WhatsApp.</w:t>
+      </w:r>
+    </w:p>
+    <w:p/>
+    <w:p>
+      <w:pPr>
+        <w:pStyle w:val="Heading2"/>
+      </w:pPr>
+      <w:r>
+        <w:rPr>
+          <w:rFonts w:ascii="Calibri" w:hAnsi="Calibri"/>
+          <w:color w:val="F47521"/>
+        </w:rPr>
+        <w:t>Messaggi pronti da inoltrare ai clienti</w:t>
+      </w:r>
+    </w:p>
+    <w:p>
+      <w:r>
+        <w:rPr>
+          <w:rFonts w:ascii="Calibri" w:hAnsi="Calibri"/>
+          <w:b w:val="0"/>
+          <w:i/>
+          <w:color w:val="2B2B2B"/>
+          <w:sz w:val="22"/>
+        </w:rPr>
+        <w:t>Copia-incolla questi testi su WhatsApp o per email. Salva il documento e tienitelo a portata di mano in negozio.</w:t>
+      </w:r>
+    </w:p>
+    <w:p/>
+    <w:p>
+      <w:r>
+        <w:rPr>
+          <w:rFonts w:ascii="Calibri" w:hAnsi="Calibri"/>
+          <w:b/>
+          <w:i w:val="0"/>
+          <w:color w:val="1F77B4"/>
+          <w:sz w:val="22"/>
+        </w:rPr>
+        <w:t>TESTO PER iPhone (iOS):</w:t>
+      </w:r>
+    </w:p>
+    <w:p>
+      <w:r>
+        <w:rPr>
+          <w:rFonts w:ascii="Calibri" w:hAnsi="Calibri"/>
+          <w:b w:val="0"/>
+          <w:i w:val="0"/>
+          <w:color w:val="2B2B2B"/>
+          <w:sz w:val="22"/>
+        </w:rPr>
+        <w:t>Ciao! Apri questo link dall'iPhone usando SAFARI (importante, non Chrome): https://silvestre-fotoservizi.web.app</w:t>
+        <w:br/>
+        <w:br/>
+        <w:t>1) Carica la pagina</w:t>
+        <w:br/>
+        <w:t>2) In basso al centro tocca l'icona Condividi (quadrato con freccia che esce verso l'alto)</w:t>
+        <w:br/>
+        <w:t>3) Scorri il menu verso il basso fino a "Aggiungi alla schermata Home"</w:t>
+        <w:br/>
+        <w:t>4) Tocca, conferma il nome "Silvestre" in alto a destra → Aggiungi</w:t>
+        <w:br/>
+        <w:t>5) Esci da Safari → trovi l'icona arancione Silvestre sulla home come una vera app</w:t>
+        <w:br/>
+        <w:br/>
+        <w:t>Pronto! Aprila da li' come fai con le altre app.</w:t>
+      </w:r>
+    </w:p>
+    <w:p/>
+    <w:p>
+      <w:r>
+        <w:rPr>
+          <w:rFonts w:ascii="Calibri" w:hAnsi="Calibri"/>
+          <w:b/>
+          <w:i w:val="0"/>
+          <w:color w:val="1F77B4"/>
+          <w:sz w:val="22"/>
+        </w:rPr>
+        <w:t>TESTO PER Android:</w:t>
+      </w:r>
+    </w:p>
+    <w:p>
+      <w:r>
+        <w:rPr>
+          <w:rFonts w:ascii="Calibri" w:hAnsi="Calibri"/>
+          <w:b w:val="0"/>
+          <w:i w:val="0"/>
+          <w:color w:val="2B2B2B"/>
+          <w:sz w:val="22"/>
+        </w:rPr>
+        <w:t>Ciao! Apri questo link dall'Android usando CHROME: https://silvestre-fotoservizi.web.app</w:t>
+        <w:br/>
+        <w:br/>
+        <w:t>OPZIONE 1 (automatica): apri la pagina, in basso compare il banner "Installa Silvestre Fotoservizi" → tocca Installa.</w:t>
+        <w:br/>
+        <w:br/>
+        <w:t>OPZIONE 2 (manuale):</w:t>
+        <w:br/>
+        <w:t>1) Carica la pagina</w:t>
+        <w:br/>
+        <w:t>2) In alto a destra tocca i 3 puntini verticali</w:t>
+        <w:br/>
+        <w:t>3) Tocca "Installa app" (o "Aggiungi a schermata Home")</w:t>
+        <w:br/>
+        <w:t>4) Conferma "Installa"</w:t>
+        <w:br/>
+        <w:br/>
+        <w:t>L'icona arancione Silvestre appare sulla home del telefono come una vera app.</w:t>
+      </w:r>
+    </w:p>
+    <w:p/>
+    <w:p>
+      <w:r>
+        <w:rPr>
+          <w:rFonts w:ascii="Calibri" w:hAnsi="Calibri"/>
+          <w:b/>
+          <w:i w:val="0"/>
+          <w:color w:val="2B2B2B"/>
+          <w:sz w:val="22"/>
+        </w:rPr>
+        <w:t>Note importanti:</w:t>
+      </w:r>
+    </w:p>
+    <w:p>
+      <w:pPr>
+        <w:pStyle w:val="ListBullet"/>
+      </w:pPr>
+      <w:r>
+        <w:rPr>
+          <w:rFonts w:ascii="Calibri" w:hAnsi="Calibri"/>
+          <w:sz w:val="22"/>
+        </w:rPr>
+        <w:t>Su iPhone NON funziona con Chrome — Apple permette "Aggiungi a Home" solo da Safari (limite Apple, non nostro).</w:t>
+      </w:r>
+    </w:p>
+    <w:p>
+      <w:pPr>
+        <w:pStyle w:val="ListBullet"/>
+      </w:pPr>
+      <w:r>
+        <w:rPr>
+          <w:rFonts w:ascii="Calibri" w:hAnsi="Calibri"/>
+          <w:sz w:val="22"/>
+        </w:rPr>
+        <w:t>Su Android funziona anche con Samsung Internet, Edge, Firefox — ma Chrome è il più semplice.</w:t>
+      </w:r>
+    </w:p>
+    <w:p>
+      <w:pPr>
+        <w:pStyle w:val="ListBullet"/>
+      </w:pPr>
+      <w:r>
+        <w:rPr>
+          <w:rFonts w:ascii="Calibri" w:hAnsi="Calibri"/>
+          <w:sz w:val="22"/>
+        </w:rPr>
+        <w:t>Anche senza "installare", il cliente può sempre usare l'app dal browser come un normale sito web.</w:t>
+      </w:r>
+    </w:p>
+    <w:p>
+      <w:pPr>
+        <w:pStyle w:val="ListBullet"/>
+      </w:pPr>
+      <w:r>
+        <w:rPr>
+          <w:rFonts w:ascii="Calibri" w:hAnsi="Calibri"/>
+          <w:sz w:val="22"/>
+        </w:rPr>
+        <w:t>Una volta installata: splash screen arancione all'avvio, schermo intero, niente barra browser. Identica a un'app scaricata dallo store.</w:t>
+      </w:r>
+    </w:p>
+    <w:p/>
+    <w:p>
+      <w:pPr>
+        <w:pStyle w:val="Heading2"/>
+      </w:pPr>
+      <w:r>
+        <w:rPr>
+          <w:rFonts w:ascii="Calibri" w:hAnsi="Calibri"/>
+          <w:color w:val="F47521"/>
+        </w:rPr>
+        <w:t>Come ricevere le modifiche</w:t>
+      </w:r>
+    </w:p>
+    <w:p>
+      <w:r>
+        <w:rPr>
+          <w:rFonts w:ascii="Calibri" w:hAnsi="Calibri"/>
+          <w:b w:val="0"/>
+          <w:i w:val="0"/>
+          <w:color w:val="2B2B2B"/>
+          <w:sz w:val="22"/>
+        </w:rPr>
+        <w:t>Quando io aggiungo funzionalità, l'app sul web NON si aggiorna da sola. Servono 2 cose:</w:t>
+      </w:r>
+    </w:p>
+    <w:p>
+      <w:pPr>
+        <w:pStyle w:val="ListBullet"/>
+      </w:pPr>
+      <w:r>
+        <w:rPr>
+          <w:rFonts w:ascii="Calibri" w:hAnsi="Calibri"/>
+          <w:sz w:val="22"/>
+        </w:rPr>
+        <w:t>Io ricompilo l'app + ridepoy (3 minuti) → versione nuova online</w:t>
+      </w:r>
+    </w:p>
+    <w:p>
+      <w:pPr>
+        <w:pStyle w:val="ListBullet"/>
+      </w:pPr>
+      <w:r>
+        <w:rPr>
+          <w:rFonts w:ascii="Calibri" w:hAnsi="Calibri"/>
+          <w:sz w:val="22"/>
+        </w:rPr>
+        <w:t>Tu fai refresh sul telefono (chiudi e riapri o ricarica la pagina) → vedi le novità</w:t>
+      </w:r>
+    </w:p>
+    <w:p/>
+    <w:p>
+      <w:pPr>
+        <w:pStyle w:val="Heading2"/>
+      </w:pPr>
+      <w:r>
+        <w:rPr>
+          <w:rFonts w:ascii="Calibri" w:hAnsi="Calibri"/>
+          <w:color w:val="F47521"/>
+        </w:rPr>
+        <w:t>Opzionale: CI/CD automatico con GitHub</w:t>
+      </w:r>
+    </w:p>
+    <w:p>
+      <w:r>
+        <w:rPr>
+          <w:rFonts w:ascii="Calibri" w:hAnsi="Calibri"/>
+          <w:b w:val="0"/>
+          <w:i w:val="0"/>
+          <w:color w:val="2B2B2B"/>
+          <w:sz w:val="22"/>
+        </w:rPr>
+        <w:t>Per ora ogni modifica richiede che IO esegua il deploy. In alternativa puoi attivare la CI/CD (Continuous Integration/Continuous Deployment): un sistema che ridepoy automaticamente ogni volta che il codice cambia.</w:t>
+      </w:r>
+    </w:p>
+    <w:p>
+      <w:r>
+        <w:rPr>
+          <w:rFonts w:ascii="Calibri" w:hAnsi="Calibri"/>
+          <w:b/>
+          <w:i w:val="0"/>
+          <w:color w:val="2B2B2B"/>
+          <w:sz w:val="22"/>
+        </w:rPr>
+        <w:t>Cosa serve:</w:t>
+      </w:r>
+    </w:p>
+    <w:p>
+      <w:pPr>
+        <w:pStyle w:val="ListBullet"/>
+      </w:pPr>
+      <w:r>
+        <w:rPr>
+          <w:rFonts w:ascii="Calibri" w:hAnsi="Calibri"/>
+          <w:sz w:val="22"/>
+        </w:rPr>
+        <w:t>Account GitHub (gratis, 3 min registrazione)</w:t>
+      </w:r>
+    </w:p>
+    <w:p>
+      <w:pPr>
+        <w:pStyle w:val="ListBullet"/>
+      </w:pPr>
+      <w:r>
+        <w:rPr>
+          <w:rFonts w:ascii="Calibri" w:hAnsi="Calibri"/>
+          <w:sz w:val="22"/>
+        </w:rPr>
+        <w:t>Repository privato su GitHub</w:t>
+      </w:r>
+    </w:p>
+    <w:p>
+      <w:pPr>
+        <w:pStyle w:val="ListBullet"/>
+      </w:pPr>
+      <w:r>
+        <w:rPr>
+          <w:rFonts w:ascii="Calibri" w:hAnsi="Calibri"/>
+          <w:sz w:val="22"/>
+        </w:rPr>
+        <w:t>Personal Access Token per dare a me accesso</w:t>
+      </w:r>
+    </w:p>
+    <w:p>
+      <w:r>
+        <w:rPr>
+          <w:rFonts w:ascii="Calibri" w:hAnsi="Calibri"/>
+          <w:b/>
+          <w:i w:val="0"/>
+          <w:color w:val="2B2B2B"/>
+          <w:sz w:val="22"/>
+        </w:rPr>
+        <w:t>Cosa cambia:</w:t>
+      </w:r>
+    </w:p>
+    <w:p>
+      <w:pPr>
+        <w:pStyle w:val="ListBullet"/>
+      </w:pPr>
+      <w:r>
+        <w:rPr>
+          <w:rFonts w:ascii="Calibri" w:hAnsi="Calibri"/>
+          <w:sz w:val="22"/>
+        </w:rPr>
+        <w:t>Pro: deploy automatico in ~3 min ad ogni modifica del codice</w:t>
+      </w:r>
+    </w:p>
+    <w:p>
+      <w:pPr>
+        <w:pStyle w:val="ListBullet"/>
+      </w:pPr>
+      <w:r>
+        <w:rPr>
+          <w:rFonts w:ascii="Calibri" w:hAnsi="Calibri"/>
+          <w:sz w:val="22"/>
+        </w:rPr>
+        <w:t>Pro: backup automatico del codice sul cloud</w:t>
+      </w:r>
+    </w:p>
+    <w:p>
+      <w:pPr>
+        <w:pStyle w:val="ListBullet"/>
+      </w:pPr>
+      <w:r>
+        <w:rPr>
+          <w:rFonts w:ascii="Calibri" w:hAnsi="Calibri"/>
+          <w:sz w:val="22"/>
+        </w:rPr>
+        <w:t>Pro: storia di tutte le modifiche consultabile</w:t>
+      </w:r>
+    </w:p>
+    <w:p>
+      <w:pPr>
+        <w:pStyle w:val="ListBullet"/>
+      </w:pPr>
+      <w:r>
+        <w:rPr>
+          <w:rFonts w:ascii="Calibri" w:hAnsi="Calibri"/>
+          <w:sz w:val="22"/>
+        </w:rPr>
+        <w:t>Con: un account in più da gestire</w:t>
+      </w:r>
+    </w:p>
+    <w:p>
+      <w:r>
+        <w:rPr>
+          <w:rFonts w:ascii="Calibri" w:hAnsi="Calibri"/>
+          <w:b/>
+          <w:color w:val="3DA35D"/>
+          <w:sz w:val="22"/>
+        </w:rPr>
+        <w:t>💡  Per uno o due deploy a settimana NON vale la fatica. Resta su "io deployo a richiesta" finché non hai team di sviluppo o vuoi backup automatico.</w:t>
       </w:r>
     </w:p>
     <w:p>

</xml_diff>